<commit_message>
Fix reconciliation, recovery exports and native document failures
</commit_message>
<xml_diff>
--- a/examples/catl-2025/deliverables/report.docx
+++ b/examples/catl-2025/deliverables/report.docx
@@ -1612,52 +1612,52 @@
     </w:p>
     <w:p>
       <w:r>
-        <w:t>资产负债关系 [R_BS]：within_precision；基础单位残差 0。基础单位人民币；原表以千元披露。按参加计算项目的独立舍入上界保留残差，不将容差内残差强制归零。</w:t>
+        <w:t>资产负债关系 [R_BS]：within_input_tolerance；基础单位残差 0。 基础单位人民币；原表以千元披露。按参加计算项目的独立舍入上界保留残差，不将容差内残差强制归零。</w:t>
       </w:r>
     </w:p>
     <w:p>
       <w:r>
-        <w:t>利润归属 [R_NI]：within_precision；基础单位残差 0。基础单位人民币；原表以千元披露。按参加计算项目的独立舍入上界保留残差，不将容差内残差强制归零。</w:t>
+        <w:t>利润归属 [R_NI]：within_input_tolerance；基础单位残差 0。 基础单位人民币；原表以千元披露。按参加计算项目的独立舍入上界保留残差，不将容差内残差强制归零。</w:t>
       </w:r>
     </w:p>
     <w:p>
       <w:r>
-        <w:t>净利润至CFO [R_CFO]：within_precision；基础单位残差 -2000。基础单位人民币；原表以千元披露。按参加计算项目的独立舍入上界保留残差，不将容差内残差强制归零。</w:t>
+        <w:t>净利润至CFO [R_CFO]：within_input_tolerance；基础单位残差 -2000。 基础单位人民币；原表以千元披露。按参加计算项目的独立舍入上界保留残差，不将容差内残差强制归零。</w:t>
       </w:r>
     </w:p>
     <w:p>
       <w:r>
-        <w:t>现金变动含汇率 [R_FX]：within_precision；基础单位残差 1000。基础单位人民币；原表以千元披露。按参加计算项目的独立舍入上界保留残差，不将容差内残差强制归零。</w:t>
+        <w:t>现金变动含汇率 [R_FX]：within_input_tolerance；基础单位残差 1000。 基础单位人民币；原表以千元披露。按参加计算项目的独立舍入上界保留残差，不将容差内残差强制归零。</w:t>
       </w:r>
     </w:p>
     <w:p>
       <w:r>
-        <w:t>现金滚动 [R_CASH]：within_precision；基础单位残差 2000。基础单位人民币；原表以千元披露。按参加计算项目的独立舍入上界保留残差，不将容差内残差强制归零。</w:t>
+        <w:t>现金滚动 [R_CASH]：within_input_tolerance；基础单位残差 2000。 基础单位人民币；原表以千元披露。按参加计算项目的独立舍入上界保留残差，不将容差内残差强制归零。</w:t>
       </w:r>
     </w:p>
     <w:p>
       <w:r>
-        <w:t>权益滚动 [R_EQ]：within_precision；基础单位残差 -1000。基础单位人民币；原表以千元披露。按参加计算项目的独立舍入上界保留残差，不将容差内残差强制归零。</w:t>
+        <w:t>权益滚动 [R_EQ]：within_input_tolerance；基础单位残差 -1000。 基础单位人民币；原表以千元披露。按参加计算项目的独立舍入上界保留残差，不将容差内残差强制归零。</w:t>
       </w:r>
     </w:p>
     <w:p>
       <w:r>
-        <w:t>融资负债滚动 [R_DEBT]：within_precision；基础单位残差 0。基础单位人民币；原表以千元披露。按参加计算项目的独立舍入上界保留残差，不将容差内残差强制归零。</w:t>
+        <w:t>融资负债滚动 [R_DEBT]：within_input_tolerance；基础单位残差 0。 基础单位人民币；原表以千元披露。按参加计算项目的独立舍入上界保留残差，不将容差内残差强制归零。</w:t>
       </w:r>
     </w:p>
     <w:p>
       <w:r>
-        <w:t>跨页供应商融资 [R_SUPPLY]：within_precision；基础单位残差 0。基础单位人民币；原表以千元披露。按参加计算项目的独立舍入上界保留残差，不将容差内残差强制归零。</w:t>
+        <w:t>跨页供应商融资 [R_SUPPLY]：within_input_tolerance；基础单位残差 0。 基础单位人民币；原表以千元披露。按参加计算项目的独立舍入上界保留残差，不将容差内残差强制归零。</w:t>
       </w:r>
     </w:p>
     <w:p>
       <w:r>
-        <w:t>货币资金桥 [R_COMPOSITION]：within_precision；基础单位残差 -1000。基础单位人民币；原表以千元披露。按参加计算项目的独立舍入上界保留残差，不将容差内残差强制归零。</w:t>
+        <w:t>货币资金桥 [R_COMPOSITION]：within_input_tolerance；基础单位残差 -1000。 基础单位人民币；原表以千元披露。按参加计算项目的独立舍入上界保留残差，不将容差内残差强制归零。</w:t>
       </w:r>
     </w:p>
     <w:p>
       <w:r>
-        <w:t>排除项目合计 [R_EXCLUDED]：within_precision；基础单位残差 1000。基础单位人民币；原表以千元披露。按参加计算项目的独立舍入上界保留残差，不将容差内残差强制归零。</w:t>
+        <w:t>排除项目合计 [R_EXCLUDED]：within_input_tolerance；基础单位残差 1000。 基础单位人民币；原表以千元披露。按参加计算项目的独立舍入上界保留残差，不将容差内残差强制归零。</w:t>
       </w:r>
     </w:p>
     <w:p>
@@ -1783,6 +1783,7 @@
         <w:t>[AR] 宁德时代新能源科技股份有限公司2025年年度报告；公布 2026-03-10</w:t>
         <w:br/>
         <w:t>https://static.cninfo.com.cn/finalpage/2026-03-10/1225002214.PDF</w:t>
+        <w:br/>
       </w:r>
     </w:p>
     <w:p>

</xml_diff>

<commit_message>
Fix review findings in period semantics, numeric references and Excel precision
</commit_message>
<xml_diff>
--- a/examples/catl-2025/deliverables/report.docx
+++ b/examples/catl-2025/deliverables/report.docx
@@ -102,6 +102,9 @@
             <w:shd w:fill="E6EEF0"/>
           </w:tcPr>
           <w:p>
+            <w:pPr>
+              <w:keepNext/>
+            </w:pPr>
             <w:r>
               <w:t>项目及记录</w:t>
             </w:r>
@@ -113,6 +116,9 @@
             <w:shd w:fill="E6EEF0"/>
           </w:tcPr>
           <w:p>
+            <w:pPr>
+              <w:keepNext/>
+            </w:pPr>
             <w:r>
               <w:t>期间及数值</w:t>
             </w:r>
@@ -124,6 +130,9 @@
             <w:shd w:fill="E6EEF0"/>
           </w:tcPr>
           <w:p>
+            <w:pPr>
+              <w:keepNext/>
+            </w:pPr>
             <w:r>
               <w:t>证据</w:t>
             </w:r>
@@ -357,6 +366,9 @@
             <w:shd w:fill="E6EEF0"/>
           </w:tcPr>
           <w:p>
+            <w:pPr>
+              <w:keepNext/>
+            </w:pPr>
             <w:r>
               <w:t>项目及记录</w:t>
             </w:r>
@@ -368,6 +380,9 @@
             <w:shd w:fill="E6EEF0"/>
           </w:tcPr>
           <w:p>
+            <w:pPr>
+              <w:keepNext/>
+            </w:pPr>
             <w:r>
               <w:t>期间及数值</w:t>
             </w:r>
@@ -379,6 +394,9 @@
             <w:shd w:fill="E6EEF0"/>
           </w:tcPr>
           <w:p>
+            <w:pPr>
+              <w:keepNext/>
+            </w:pPr>
             <w:r>
               <w:t>证据</w:t>
             </w:r>
@@ -612,6 +630,9 @@
             <w:shd w:fill="E6EEF0"/>
           </w:tcPr>
           <w:p>
+            <w:pPr>
+              <w:keepNext/>
+            </w:pPr>
             <w:r>
               <w:t>项目及记录</w:t>
             </w:r>
@@ -623,6 +644,9 @@
             <w:shd w:fill="E6EEF0"/>
           </w:tcPr>
           <w:p>
+            <w:pPr>
+              <w:keepNext/>
+            </w:pPr>
             <w:r>
               <w:t>期间及数值</w:t>
             </w:r>
@@ -634,6 +658,9 @@
             <w:shd w:fill="E6EEF0"/>
           </w:tcPr>
           <w:p>
+            <w:pPr>
+              <w:keepNext/>
+            </w:pPr>
             <w:r>
               <w:t>证据</w:t>
             </w:r>
@@ -867,6 +894,9 @@
             <w:shd w:fill="E6EEF0"/>
           </w:tcPr>
           <w:p>
+            <w:pPr>
+              <w:keepNext/>
+            </w:pPr>
             <w:r>
               <w:t>项目及记录</w:t>
             </w:r>
@@ -878,6 +908,9 @@
             <w:shd w:fill="E6EEF0"/>
           </w:tcPr>
           <w:p>
+            <w:pPr>
+              <w:keepNext/>
+            </w:pPr>
             <w:r>
               <w:t>期间及数值</w:t>
             </w:r>
@@ -889,6 +922,9 @@
             <w:shd w:fill="E6EEF0"/>
           </w:tcPr>
           <w:p>
+            <w:pPr>
+              <w:keepNext/>
+            </w:pPr>
             <w:r>
               <w:t>证据</w:t>
             </w:r>
@@ -1085,6 +1121,9 @@
             <w:shd w:fill="E6EEF0"/>
           </w:tcPr>
           <w:p>
+            <w:pPr>
+              <w:keepNext/>
+            </w:pPr>
             <w:r>
               <w:t>项目及记录</w:t>
             </w:r>
@@ -1096,6 +1135,9 @@
             <w:shd w:fill="E6EEF0"/>
           </w:tcPr>
           <w:p>
+            <w:pPr>
+              <w:keepNext/>
+            </w:pPr>
             <w:r>
               <w:t>期间及数值</w:t>
             </w:r>
@@ -1107,6 +1149,9 @@
             <w:shd w:fill="E6EEF0"/>
           </w:tcPr>
           <w:p>
+            <w:pPr>
+              <w:keepNext/>
+            </w:pPr>
             <w:r>
               <w:t>证据</w:t>
             </w:r>
@@ -1340,6 +1385,9 @@
             <w:shd w:fill="E6EEF0"/>
           </w:tcPr>
           <w:p>
+            <w:pPr>
+              <w:keepNext/>
+            </w:pPr>
             <w:r>
               <w:t>项目及记录</w:t>
             </w:r>
@@ -1351,6 +1399,9 @@
             <w:shd w:fill="E6EEF0"/>
           </w:tcPr>
           <w:p>
+            <w:pPr>
+              <w:keepNext/>
+            </w:pPr>
             <w:r>
               <w:t>期间及数值</w:t>
             </w:r>
@@ -1362,6 +1413,9 @@
             <w:shd w:fill="E6EEF0"/>
           </w:tcPr>
           <w:p>
+            <w:pPr>
+              <w:keepNext/>
+            </w:pPr>
             <w:r>
               <w:t>证据</w:t>
             </w:r>

</xml_diff>

<commit_message>
Deepen tax and bank credit analysis and validate cash paths
</commit_message>
<xml_diff>
--- a/examples/catl-2025/deliverables/report.docx
+++ b/examples/catl-2025/deliverables/report.docx
@@ -21,6 +21,11 @@
       </w:r>
     </w:p>
     <w:p>
+      <w:r>
+        <w:t>方法与适用范围：年报四表及附注复算；分析者明确口径的供应商融资敏感性</w:t>
+      </w:r>
+    </w:p>
+    <w:p>
       <w:pPr>
         <w:pStyle w:val="Heading1"/>
       </w:pPr>
@@ -30,17 +35,17 @@
     </w:p>
     <w:p>
       <w:r>
-        <w:t>收入增长17.04%，动力系统增长25.08%，储能增长8.99%，材料回收同比-23.83%。 [F_GROWTH; E_BIZ, revenue_growth, volume_growth]</w:t>
+        <w:t>[conditional] 收入增长17.04%，动力系统增长25.08%，储能增长8.99%，材料回收同比-23.83%。 [F_GROWTH; E_BIZ, revenue_growth, volume_growth]</w:t>
       </w:r>
     </w:p>
     <w:p>
       <w:r>
-        <w:t>CFO为1,332.20 亿元人民币，与总净利润之比173.49%；营运资本三项合计贡献332.16 亿元人民币。 [F_CASH; E_BRIDGE, cfo_bridge, working_capital_effect, fcf_simple]</w:t>
+        <w:t>[conditional] CFO为1,332.20 亿元人民币，与总净利润之比173.49%；营运资本三项合计贡献332.16 亿元人民币。 [F_CASH; E_BRIDGE, cfo_bridge, working_capital_effect, fcf_simple]</w:t>
       </w:r>
     </w:p>
     <w:p>
       <w:r>
-        <w:t>跨页融资安排合计372.23 亿元人民币，较期初变动-71.40 亿元人民币；供应商已收款307.28 亿元人民币是其中一部分。 [F_SUPPLY; E_SUPPLY, supply_components, supply_change]</w:t>
+        <w:t>[conditional] 跨页融资安排合计372.23 亿元人民币，较期初变动-71.40 亿元人民币；供应商已收款307.28 亿元人民币是其中一部分。 [F_SUPPLY; E_SUPPLY, supply_components, supply_change]</w:t>
       </w:r>
     </w:p>
     <w:p>
@@ -294,7 +299,7 @@
         <w:pStyle w:val="Heading2"/>
       </w:pPr>
       <w:r>
-        <w:t>增长集中于动力电池且需要解释量价结构 [F_GROWTH]</w:t>
+        <w:t>增长集中于动力电池且需要解释量价结构 [F_GROWTH; conditional]</w:t>
       </w:r>
     </w:p>
     <w:p>
@@ -558,7 +563,7 @@
         <w:pStyle w:val="Heading2"/>
       </w:pPr>
       <w:r>
-        <w:t>现金表现强但依赖经营负债提供资金 [F_CASH]</w:t>
+        <w:t>现金表现强但依赖经营负债提供资金 [F_CASH; conditional]</w:t>
       </w:r>
     </w:p>
     <w:p>
@@ -822,7 +827,7 @@
         <w:pStyle w:val="Heading2"/>
       </w:pPr>
       <w:r>
-        <w:t>供应商融资总额下降仍有撤回与集中风险 [F_SUPPLY]</w:t>
+        <w:t>供应商融资总额下降仍有撤回与集中风险 [F_SUPPLY; conditional]</w:t>
       </w:r>
     </w:p>
     <w:p>
@@ -832,7 +837,7 @@
     </w:p>
     <w:p>
       <w:r>
-        <w:t>余额下降反驳“全部现金改善来自供应链融资新增”的解释。把全部安排一次性纳入债务的敏感性口径为1,568.24 亿元人民币；需合同条款决定信用分类。</w:t>
+        <w:t>余额是存量，不能凭其下降判断新增融资或CFO同比贡献。需按两期新增、现金结算、非现金变动及现金流分类建立桥接。全额计债仅作敏感性分析：1,568.24 亿元人民币。</w:t>
       </w:r>
     </w:p>
     <w:p>
@@ -852,7 +857,7 @@
     </w:p>
     <w:p>
       <w:r>
-        <w:t>判断改变条件：取得融资机构、到期梯度及撤回条款，重算现金缺口和债务口径；不能把存量总额直接当本期CFO调整额。</w:t>
+        <w:t>判断改变条件：核实合同分类、融资机构、到期梯度及撤回条款，重算现金缺口和债务口径；不能把存量总额直接当本期CFO调整额。</w:t>
       </w:r>
     </w:p>
     <w:p>
@@ -1049,7 +1054,7 @@
         <w:pStyle w:val="Heading2"/>
       </w:pPr>
       <w:r>
-        <w:t>账面资金不能直接当法人偿债现金 [F_LIQUIDITY]</w:t>
+        <w:t>账面资金不能直接当法人偿债现金 [F_LIQUIDITY; conditional]</w:t>
       </w:r>
     </w:p>
     <w:p>
@@ -1313,7 +1318,7 @@
         <w:pStyle w:val="Heading2"/>
       </w:pPr>
       <w:r>
-        <w:t>扩张中的减值与售后成本需要单独验证 [F_ESTIMATES]</w:t>
+        <w:t>扩张中的减值与售后成本需要单独验证 [F_ESTIMATES; conditional]</w:t>
       </w:r>
     </w:p>
     <w:p>
@@ -1577,7 +1582,7 @@
         <w:pStyle w:val="Heading2"/>
       </w:pPr>
       <w:r>
-        <w:t>权益增长同时包含利润与资本交易 [F_EQUITY]</w:t>
+        <w:t>权益增长同时包含利润与资本交易 [F_EQUITY; conditional]</w:t>
       </w:r>
     </w:p>
     <w:p>
@@ -1623,7 +1628,7 @@
         <w:pStyle w:val="Heading2"/>
       </w:pPr>
       <w:r>
-        <w:t>审计重点是追加程序的起点 [F_AUDIT]</w:t>
+        <w:t>审计重点是追加程序的起点 [F_AUDIT; supported]</w:t>
       </w:r>
     </w:p>
     <w:p>

</xml_diff>

<commit_message>
Restore existing procedure provenance in published Word examples
</commit_message>
<xml_diff>
--- a/examples/catl-2025/deliverables/report.docx
+++ b/examples/catl-2025/deliverables/report.docx
@@ -1737,7 +1737,7 @@
     </w:p>
     <w:p>
       <w:r>
-        <w:t>状态 performed；认定 准确性、列报；总体 本例已列事实所对应的报表及附注；选取 按现金、债务、利润归属、权益及供应商融资重要问题选取；非审计抽样。</w:t>
+        <w:t>状态 performed；执行者 Codex 本次公开资料分析；执行日期 2026-10-02；认定 准确性、列报；总体 本例已列事实所对应的报表及附注；选取 按现金、债务、利润归属、权益及供应商融资重要问题选取；非审计抽样。</w:t>
       </w:r>
     </w:p>
     <w:p>
@@ -1770,7 +1770,7 @@
     </w:p>
     <w:p>
       <w:r>
-        <w:t>状态 awaiting_data；认定 发生、截止、准确性；总体 年末前后主要客户交付、验收及返利合同与收入明细；选取 待取得总体与重要性后确定；不能以年报披露金额代替总体。</w:t>
+        <w:t>状态 awaiting_data；执行者 未记录；执行日期 未记录；认定 发生、截止、准确性；总体 年末前后主要客户交付、验收及返利合同与收入明细；选取 待取得总体与重要性后确定；不能以年报披露金额代替总体。</w:t>
       </w:r>
     </w:p>
     <w:p>

</xml_diff>